<commit_message>
Updated the project to contain the new ip configurations and documentation
</commit_message>
<xml_diff>
--- a/docs/VDA5050_ROX_Diff_Crane_Commissioning_Runbook.docx
+++ b/docs/VDA5050_ROX_Diff_Crane_Commissioning_Runbook.docx
@@ -46,7 +46,11 @@
         </w:rPr>
         <w:t>Prepared for the VDA5050 Paper project</w:t>
         <w:br/>
-        <w:t>20 July 2026</w:t>
+        <w:t>21 July 2026</w:t>
+      </w:r>
+      <w:r>
+        <w:br/>
+        <w:t>Network and repository audit revision</w:t>
       </w:r>
     </w:p>
     <w:tbl>
@@ -255,10 +259,7 @@
         <w:rPr>
           <w:b/>
         </w:rPr>
-        <w:t xml:space="preserve">Manual fields: </w:t>
-      </w:r>
-      <w:r>
-        <w:t>Complete Appendix A on the real equipment. Unknown addresses, launch filenames, frames, topics, physical dimensions and PLC credentials are deliberately not guessed.</w:t>
+        <w:t>Manual fields: Complete Appendix A on the real equipment. The known Pi and ROX DTLabOpen addresses are recorded below; prefix lengths, gateways, launch filenames, frames, topics, physical dimensions and PLC credentials must still be verified on site.</w:t>
       </w:r>
     </w:p>
     <w:p>
@@ -298,18 +299,7 @@
         <w:rPr>
           <w:b/>
         </w:rPr>
-        <w:t>Raspberry Pi / MQTT example address:</w:t>
-      </w:r>
-      <w:r>
-        <w:t xml:space="preserve"> </w:t>
-      </w:r>
-      <w:r>
-        <w:rPr>
-          <w:rFonts w:ascii="Liberation Mono" w:hAnsi="Liberation Mono"/>
-          <w:color w:val="2A404D"/>
-          <w:sz w:val="18"/>
-        </w:rPr>
-        <w:t>192.168.1.115</w:t>
+        <w:t>Raspberry Pi MQTT address on DTLabOpen: 192.168.50.115</w:t>
       </w:r>
     </w:p>
     <w:p>
@@ -368,6 +358,128 @@
         </w:pBdr>
         <w:spacing w:after="160"/>
       </w:pPr>
+    </w:p>
+    <w:p>
+      <w:pPr>
+        <w:pStyle w:val="Heading2"/>
+      </w:pPr>
+      <w:r>
+        <w:t>Current network architecture</w:t>
+      </w:r>
+    </w:p>
+    <w:p>
+      <w:pPr/>
+      <w:r>
+        <w:t>The Raspberry Pi is dual-homed. Its DTLabOpen Ethernet interface is the direct MQTT/Flask path to the ROX-Diff, while its Ilmatar Wi-Fi interface remains a separate connection for the private Ilmatar network. The ROX-Diff and Pi are direct peers on DTLabOpen; no intermediate training network or NAT path is used.</w:t>
+      </w:r>
+    </w:p>
+    <w:p>
+      <w:pPr/>
+      <w:r>
+        <w:t>Known and verified values:</w:t>
+      </w:r>
+    </w:p>
+    <w:p>
+      <w:pPr>
+        <w:pStyle w:val="ListBullet"/>
+      </w:pPr>
+      <w:r>
+        <w:t>Pi Ethernet on DTLabOpen: 192.168.50.115 (verify the actual prefix length with ip -br address).</w:t>
+      </w:r>
+    </w:p>
+    <w:p>
+      <w:pPr>
+        <w:pStyle w:val="ListBullet"/>
+      </w:pPr>
+      <w:r>
+        <w:t>Pi Wi-Fi on Ilmatar: 192.168.0.116 (verify the actual prefix length and gateway).</w:t>
+      </w:r>
+    </w:p>
+    <w:p>
+      <w:pPr>
+        <w:pStyle w:val="ListBullet"/>
+      </w:pPr>
+      <w:r>
+        <w:t>DTLabOpen gateway: 192.168.1.1 (unchanged). Keep the Pi default-route behavior exactly as verified on the working system; do not change it merely for this project.</w:t>
+      </w:r>
+    </w:p>
+    <w:p>
+      <w:pPr>
+        <w:pStyle w:val="ListBullet"/>
+      </w:pPr>
+      <w:r>
+        <w:t>ROX-Diff DTLabOpen address: 192.168.50.50 (static; verify the actual prefix length and interface name).</w:t>
+      </w:r>
+    </w:p>
+    <w:p>
+      <w:pPr>
+        <w:pStyle w:val="ListBullet"/>
+      </w:pPr>
+      <w:r>
+        <w:t>ROX-Diff network connection: DTLabOpen with static IPv4 address 192.168.50.50.</w:t>
+      </w:r>
+    </w:p>
+    <w:p>
+      <w:pPr>
+        <w:pStyle w:val="ListBullet"/>
+      </w:pPr>
+      <w:r>
+        <w:t>ROX-Diff internal control/safety network stays separate. Do not renumber scanner, FlexiSoft, relay-board or robot-internal devices merely to match the training network.</w:t>
+      </w:r>
+    </w:p>
+    <w:p>
+      <w:pPr/>
+      <w:r>
+        <w:t>The normal communication path is direct over DTLabOpen: ROX-Diff 192.168.50.50 &lt;-&gt; Raspberry Pi 192.168.50.115. MQTT uses 192.168.50.115:1883 and the Flask interface uses 192.168.50.115:5000. Because both devices are on the same DTLabOpen network, no NAT, port-forward or additional route is required for normal bidirectional communication.</w:t>
+      </w:r>
+    </w:p>
+    <w:p>
+      <w:pPr/>
+      <w:r>
+        <w:t>Verify the Pi interfaces and routes before starting Mosquitto:</w:t>
+      </w:r>
+    </w:p>
+    <w:p>
+      <w:pPr>
+        <w:pStyle w:val="MacroText"/>
+      </w:pPr>
+      <w:r>
+        <w:t>ip -br address</w:t>
+        <w:br/>
+        <w:t>ip route</w:t>
+        <w:br/>
+        <w:t>nmcli -f NAME,DEVICE,TYPE,IP4.ADDRESS,IP4.GATEWAY connection show --active</w:t>
+        <w:br/>
+        <w:t>ip route get 192.168.1.1</w:t>
+      </w:r>
+    </w:p>
+    <w:p>
+      <w:pPr/>
+      <w:r>
+        <w:t>The route table must contain only one preferred default route, through Ilmatar. If the DTLabOpen NetworkManager profile also installs a default route, disable it without changing the static address:</w:t>
+      </w:r>
+    </w:p>
+    <w:p>
+      <w:pPr>
+        <w:pStyle w:val="MacroText"/>
+      </w:pPr>
+      <w:r>
+        <w:t>sudo nmcli connection modify "&lt;DTLabOpen profile&gt;" \</w:t>
+        <w:br/>
+        <w:t xml:space="preserve">  ipv4.never-default yes ipv6.never-default yes</w:t>
+        <w:br/>
+        <w:t>sudo nmcli connection up "&lt;DTLabOpen profile&gt;"</w:t>
+      </w:r>
+    </w:p>
+    <w:p>
+      <w:pPr/>
+      <w:r>
+        <w:t>Do not move the Pi Ethernet interface to 192.168.0.x while its Ilmatar Wi-Fi is also 192.168.0.x. Two active interfaces in the same subnet create ambiguous routing and ARP behavior.</w:t>
+      </w:r>
+    </w:p>
+    <w:p>
+      <w:pPr/>
+      <w:r/>
     </w:p>
     <w:p>
       <w:pPr>
@@ -420,45 +532,16 @@
             </w:tcMar>
           </w:tcPr>
           <w:p>
-            <w:pPr>
-              <w:keepLines/>
-              <w:spacing w:after="0" w:line="240" w:lineRule="auto" w:before="0"/>
-            </w:pPr>
             <w:r>
-              <w:rPr>
-                <w:rFonts w:ascii="Liberation Mono" w:hAnsi="Liberation Mono"/>
-                <w:color w:val="1C2D38"/>
-                <w:sz w:val="16"/>
-              </w:rPr>
               <w:t>cd ~</w:t>
-            </w:r>
-          </w:p>
-          <w:p>
-            <w:pPr>
-              <w:keepLines/>
-              <w:spacing w:after="0" w:before="0" w:line="240" w:lineRule="auto"/>
-            </w:pPr>
-            <w:r>
-              <w:rPr>
-                <w:rFonts w:ascii="Liberation Mono" w:hAnsi="Liberation Mono"/>
-                <w:color w:val="1C2D38"/>
-                <w:sz w:val="16"/>
-              </w:rPr>
+              <w:br/>
               <w:t>git clone https://github.com/Huxyshuu/VDA5050-Paper-Dev.git</w:t>
-            </w:r>
-          </w:p>
-          <w:p>
-            <w:pPr>
-              <w:keepLines/>
-              <w:spacing w:after="0" w:before="0" w:line="240" w:lineRule="auto"/>
-            </w:pPr>
-            <w:r>
-              <w:rPr>
-                <w:rFonts w:ascii="Liberation Mono" w:hAnsi="Liberation Mono"/>
-                <w:color w:val="1C2D38"/>
-                <w:sz w:val="16"/>
-              </w:rPr>
+              <w:br/>
               <w:t>cd ~/VDA5050-Paper-Dev</w:t>
+              <w:br/>
+              <w:t>git pull --ff-only</w:t>
+              <w:br/>
+              <w:t>git rev-parse --short HEAD</w:t>
             </w:r>
           </w:p>
         </w:tc>
@@ -636,6 +719,28 @@
       <w:pPr>
         <w:spacing w:after="0"/>
       </w:pPr>
+    </w:p>
+    <w:p>
+      <w:pPr/>
+      <w:r>
+        <w:t>Repository preflight: the public main branch inspected on 21 July 2026 still contained a tracked crane credential file and commented-out credential ignore rules. Before crane work, follow the credential-remediation steps in Part G2. Do not copy a credential-bearing checkout to additional devices.</w:t>
+      </w:r>
+    </w:p>
+    <w:p>
+      <w:pPr/>
+      <w:r>
+        <w:t>Record the exact revision used for every test:</w:t>
+      </w:r>
+    </w:p>
+    <w:p>
+      <w:pPr>
+        <w:pStyle w:val="MacroText"/>
+      </w:pPr>
+      <w:r>
+        <w:t>git status --short</w:t>
+        <w:br/>
+        <w:t>git log -1 --oneline</w:t>
+      </w:r>
     </w:p>
     <w:p>
       <w:pPr>
@@ -1001,7 +1106,7 @@
                 <w:color w:val="1C2D38"/>
                 <w:sz w:val="16"/>
               </w:rPr>
-              <w:t>VDA_MQTT_HOST=192.168.1.115</w:t>
+              <w:t>VDA_MQTT_HOST=192.168.50.115</w:t>
             </w:r>
           </w:p>
           <w:p>
@@ -1167,6 +1272,12 @@
       </w:r>
     </w:p>
     <w:p>
+      <w:pPr/>
+      <w:r>
+        <w:t>Use 192.168.50.115 because it is the Pi address directly reachable by the ROX-Diff on DTLabOpen. Do not substitute the Ilmatar Wi-Fi address 192.168.0.116 in the ROX adapter configuration.</w:t>
+      </w:r>
+    </w:p>
+    <w:p>
       <w:pPr>
         <w:pStyle w:val="Heading2"/>
       </w:pPr>
@@ -1352,6 +1463,24 @@
       </w:r>
     </w:p>
     <w:p>
+      <w:pPr/>
+      <w:r>
+        <w:t>Because the Pi also connects to Ilmatar, confirm that anonymous MQTT is not unintentionally reachable from the Ilmatar interface. Bind or firewall the lab listener to loopback and the DTLabOpen-facing address 192.168.50.115, or enable authentication/TLS. Test both intended and unintended interfaces before motion commissioning.</w:t>
+      </w:r>
+    </w:p>
+    <w:p>
+      <w:pPr>
+        <w:pStyle w:val="MacroText"/>
+      </w:pPr>
+      <w:r>
+        <w:t>ss -ltnp | grep 1883</w:t>
+        <w:br/>
+        <w:t>nc -vz 192.168.50.115 1883</w:t>
+        <w:br/>
+        <w:t># From an Ilmatar-side host, TCP 1883 should be blocked unless explicitly approved.</w:t>
+      </w:r>
+    </w:p>
+    <w:p>
       <w:pPr>
         <w:pStyle w:val="Heading2"/>
       </w:pPr>
@@ -1438,6 +1567,24 @@
       </w:r>
       <w:r>
         <w:t>. These checks validate source syntax, schemas and generated test messages; they do not test ROS, Nav2, the PLC or physical hardware.</w:t>
+      </w:r>
+    </w:p>
+    <w:p>
+      <w:pPr/>
+      <w:r>
+        <w:t>Also verify that no credential file is tracked and no local secret appears in the working-tree diff:</w:t>
+      </w:r>
+    </w:p>
+    <w:p>
+      <w:pPr>
+        <w:pStyle w:val="MacroText"/>
+      </w:pPr>
+      <w:r>
+        <w:t>git ls-files crane_edge/access.txt legacy/RaspberryPI/accesscode_url.txt</w:t>
+        <w:br/>
+        <w:t>git status --short</w:t>
+        <w:br/>
+        <w:t>git diff --check</w:t>
       </w:r>
     </w:p>
     <w:p>
@@ -1689,7 +1836,7 @@
                 <w:color w:val="1C2D38"/>
                 <w:sz w:val="16"/>
               </w:rPr>
-              <w:t>http://192.168.1.115:5000</w:t>
+              <w:t>http://192.168.50.115:5000</w:t>
             </w:r>
           </w:p>
         </w:tc>
@@ -1759,45 +1906,16 @@
             </w:tcMar>
           </w:tcPr>
           <w:p>
-            <w:pPr>
-              <w:keepLines/>
-              <w:spacing w:after="0" w:line="240" w:lineRule="auto" w:before="0"/>
-            </w:pPr>
             <w:r>
-              <w:rPr>
-                <w:rFonts w:ascii="Liberation Mono" w:hAnsi="Liberation Mono"/>
-                <w:color w:val="1C2D38"/>
-                <w:sz w:val="16"/>
-              </w:rPr>
               <w:t>cd ~</w:t>
-            </w:r>
-          </w:p>
-          <w:p>
-            <w:pPr>
-              <w:keepLines/>
-              <w:spacing w:after="0" w:before="0" w:line="240" w:lineRule="auto"/>
-            </w:pPr>
-            <w:r>
-              <w:rPr>
-                <w:rFonts w:ascii="Liberation Mono" w:hAnsi="Liberation Mono"/>
-                <w:color w:val="1C2D38"/>
-                <w:sz w:val="16"/>
-              </w:rPr>
+              <w:br/>
               <w:t>git clone https://github.com/Huxyshuu/VDA5050-Paper-Dev.git</w:t>
-            </w:r>
-          </w:p>
-          <w:p>
-            <w:pPr>
-              <w:keepLines/>
-              <w:spacing w:after="0" w:before="0" w:line="240" w:lineRule="auto"/>
-            </w:pPr>
-            <w:r>
-              <w:rPr>
-                <w:rFonts w:ascii="Liberation Mono" w:hAnsi="Liberation Mono"/>
-                <w:color w:val="1C2D38"/>
-                <w:sz w:val="16"/>
-              </w:rPr>
+              <w:br/>
               <w:t>cd ~/VDA5050-Paper-Dev</w:t>
+              <w:br/>
+              <w:t>git pull --ff-only</w:t>
+              <w:br/>
+              <w:t>git rev-parse --short HEAD</w:t>
             </w:r>
           </w:p>
         </w:tc>
@@ -1917,7 +2035,7 @@
         <w:spacing w:after="100"/>
       </w:pPr>
       <w:r>
-        <w:t>The helper scripts assume:</w:t>
+        <w:t>The current site record and helper-script default use:</w:t>
       </w:r>
     </w:p>
     <w:tbl>
@@ -1956,7 +2074,7 @@
                 <w:color w:val="1C2D38"/>
                 <w:sz w:val="16"/>
               </w:rPr>
-              <w:t>ROS_DISTRO=humble</w:t>
+              <w:t>ROS_DISTRO=jazzy</w:t>
             </w:r>
           </w:p>
           <w:p>
@@ -1987,7 +2105,7 @@
         <w:spacing w:after="100"/>
       </w:pPr>
       <w:r>
-        <w:t>Set different values if your delivered robot differs:</w:t>
+        <w:t>Verify these values on the delivered robot and set different values if required:</w:t>
       </w:r>
     </w:p>
     <w:tbl>
@@ -2096,7 +2214,7 @@
                 <w:color w:val="1C2D38"/>
                 <w:sz w:val="16"/>
               </w:rPr>
-              <w:t>export ROS_DISTRO=humble</w:t>
+              <w:t>export ROS_DISTRO=jazzy</w:t>
             </w:r>
           </w:p>
           <w:p>
@@ -2526,7 +2644,7 @@
                 <w:color w:val="1C2D38"/>
                 <w:sz w:val="16"/>
               </w:rPr>
-              <w:t>export ROS_DISTRO=${ROS_DISTRO:-humble}</w:t>
+              <w:t>export ROS_DISTRO=${ROS_DISTRO:-jazzy}</w:t>
             </w:r>
           </w:p>
           <w:p>
@@ -2610,7 +2728,7 @@
                 <w:color w:val="1C2D38"/>
                 <w:sz w:val="16"/>
               </w:rPr>
-              <w:t>export ROS_DISTRO=${ROS_DISTRO:-humble}</w:t>
+              <w:t>export ROS_DISTRO=${ROS_DISTRO:-jazzy}</w:t>
             </w:r>
           </w:p>
           <w:p>
@@ -2791,7 +2909,7 @@
                 <w:color w:val="1C2D38"/>
                 <w:sz w:val="16"/>
               </w:rPr>
-              <w:t>ping -c 3 192.168.1.115</w:t>
+              <w:t>ping -c 3 192.168.50.115</w:t>
             </w:r>
           </w:p>
           <w:p>
@@ -2805,7 +2923,7 @@
                 <w:color w:val="1C2D38"/>
                 <w:sz w:val="16"/>
               </w:rPr>
-              <w:t>nc -vz 192.168.1.115 1883</w:t>
+              <w:t>nc -vz 192.168.50.115 1883</w:t>
             </w:r>
           </w:p>
         </w:tc>
@@ -2945,7 +3063,7 @@
                 <w:color w:val="1C2D38"/>
                 <w:sz w:val="16"/>
               </w:rPr>
-              <w:t>./scripts/check_pi_mqtt_from_rox.sh 192.168.1.115 1883</w:t>
+              <w:t>./scripts/check_pi_mqtt_from_rox.sh 192.168.50.115 1883</w:t>
             </w:r>
           </w:p>
         </w:tc>
@@ -3025,6 +3143,34 @@
       <w:pPr>
         <w:spacing w:after="0"/>
       </w:pPr>
+    </w:p>
+    <w:p>
+      <w:pPr/>
+      <w:r>
+        <w:t>The ROX-Diff should be connected directly to DTLabOpen with static address 192.168.50.50. Confirm that traffic to the Pi address 192.168.50.115 uses the DTLabOpen-facing interface:</w:t>
+      </w:r>
+    </w:p>
+    <w:p>
+      <w:pPr>
+        <w:pStyle w:val="MacroText"/>
+      </w:pPr>
+      <w:r>
+        <w:t>ip -br address</w:t>
+        <w:br/>
+        <w:t>ip route</w:t>
+        <w:br/>
+        <w:t>ip route get 192.168.50.115</w:t>
+        <w:br/>
+        <w:t>ping -c 3 192.168.50.115</w:t>
+        <w:br/>
+        <w:t>nc -vz 192.168.50.115 1883</w:t>
+      </w:r>
+    </w:p>
+    <w:p>
+      <w:pPr/>
+      <w:r>
+        <w:t>Acceptance requires bidirectional IP connectivity between 192.168.50.50 and 192.168.50.115, plus a successful ROX-to-Pi MQTT test on TCP port 1883.</w:t>
+      </w:r>
     </w:p>
     <w:p>
       <w:pPr>
@@ -5170,7 +5316,7 @@
                 <w:color w:val="1C2D38"/>
                 <w:sz w:val="16"/>
               </w:rPr>
-              <w:t xml:space="preserve">  &lt;PI_USER&gt;@192.168.1.115:/home/&lt;PI_USER&gt;/VDA5050-Paper-Dev/configs/</w:t>
+              <w:t xml:space="preserve">  &lt;PI_USER&gt;@192.168.50.115:/home/&lt;PI_USER&gt;/VDA5050-Paper-Dev/configs/</w:t>
             </w:r>
           </w:p>
         </w:tc>
@@ -5199,6 +5345,12 @@
       </w:r>
       <w:r>
         <w:t xml:space="preserve"> with the real Pi username.</w:t>
+      </w:r>
+    </w:p>
+    <w:p>
+      <w:pPr/>
+      <w:r>
+        <w:t>This SCP command runs directly from the ROX-Diff on DTLabOpen to the Pi at 192.168.50.115. If it fails, verify SSH is enabled on the Pi, test TCP port 22 and confirm the Pi username and destination path.</w:t>
       </w:r>
     </w:p>
     <w:p>
@@ -5622,7 +5774,7 @@
                 <w:color w:val="1C2D38"/>
                 <w:sz w:val="16"/>
               </w:rPr>
-              <w:t>export ROS_DISTRO=${ROS_DISTRO:-humble}</w:t>
+              <w:t>export ROS_DISTRO=${ROS_DISTRO:-jazzy}</w:t>
             </w:r>
           </w:p>
           <w:p>
@@ -5650,7 +5802,7 @@
                 <w:color w:val="1C2D38"/>
                 <w:sz w:val="16"/>
               </w:rPr>
-              <w:t>export VDA_MQTT_HOST=192.168.1.115</w:t>
+              <w:t>export VDA_MQTT_HOST=192.168.50.115</w:t>
             </w:r>
           </w:p>
           <w:p>
@@ -5772,6 +5924,12 @@
       <w:pPr>
         <w:spacing w:after="0"/>
       </w:pPr>
+    </w:p>
+    <w:p>
+      <w:pPr/>
+      <w:r>
+        <w:t>Keep VDA_MQTT_HOST=192.168.50.115. The ROX-Diff and Pi communicate directly on DTLabOpen, so no port-forwarding or additional routing is required for VDA messages.</w:t>
+      </w:r>
     </w:p>
     <w:p>
       <w:pPr>
@@ -6389,7 +6547,7 @@
                 <w:color w:val="1C2D38"/>
                 <w:sz w:val="16"/>
               </w:rPr>
-              <w:t>export ROS_DISTRO=${ROS_DISTRO:-humble}</w:t>
+              <w:t>export ROS_DISTRO=${ROS_DISTRO:-jazzy}</w:t>
             </w:r>
           </w:p>
           <w:p>
@@ -6417,7 +6575,7 @@
                 <w:color w:val="1C2D38"/>
                 <w:sz w:val="16"/>
               </w:rPr>
-              <w:t>export VDA_MQTT_HOST=192.168.1.115</w:t>
+              <w:t>export VDA_MQTT_HOST=192.168.50.115</w:t>
             </w:r>
           </w:p>
           <w:p>
@@ -7263,6 +7421,36 @@
       </w:r>
     </w:p>
     <w:p>
+      <w:pPr/>
+      <w:r>
+        <w:t>Critical public-repository remediation before continuing: rotate/revoke the previously published crane access code, remove crane_edge/access.txt from Git tracking, add the credential paths to .gitignore, and purge the secret from repository history. Merely deleting the file in a new commit does not remove it from earlier commits. Coordinate any history rewrite with collaborators and make fresh clones afterward.</w:t>
+      </w:r>
+    </w:p>
+    <w:p>
+      <w:pPr>
+        <w:pStyle w:val="MacroText"/>
+      </w:pPr>
+      <w:r>
+        <w:t>cd ~/VDA5050-Paper-Dev</w:t>
+        <w:br/>
+        <w:t>git rm --cached --ignore-unmatch crane_edge/access.txt</w:t>
+        <w:br/>
+        <w:t>printf "\n# Local credentials\ncrane_edge/access.txt\naccess.txt\naccesscode_url.txt\n" &gt;&gt; .gitignore</w:t>
+        <w:br/>
+        <w:t>git status --short</w:t>
+        <w:br/>
+        <w:t># Rotate the credential at the crane/PLC side before using the adapter.</w:t>
+        <w:br/>
+        <w:t># Use git-filter-repo or an approved equivalent to purge the old secret from history.</w:t>
+      </w:r>
+    </w:p>
+    <w:p>
+      <w:pPr/>
+      <w:r>
+        <w:t>Never paste the replacement access code into a command history, document, issue, chat log or committed environment file. Prefer protected environment injection or a mode-600 local file that is confirmed untracked.</w:t>
+      </w:r>
+    </w:p>
+    <w:p>
       <w:pPr>
         <w:pStyle w:val="Heading2"/>
       </w:pPr>
@@ -7580,7 +7768,7 @@
                 <w:color w:val="1C2D38"/>
                 <w:sz w:val="16"/>
               </w:rPr>
-              <w:t>export VDA_MQTT_HOST=192.168.1.115</w:t>
+              <w:t>export VDA_MQTT_HOST=192.168.50.115</w:t>
             </w:r>
           </w:p>
           <w:p>
@@ -9107,6 +9295,57 @@
         <w:pStyle w:val="Heading2"/>
       </w:pPr>
       <w:r>
+        <w:t>DTLabOpen is connected but the Pi or ROX is unreachable</w:t>
+      </w:r>
+    </w:p>
+    <w:p>
+      <w:pPr/>
+      <w:r>
+        <w:t>On both devices, verify the DTLabOpen addresses and the route selected for the peer. On the Pi, also confirm that the separate Ilmatar Wi-Fi connection still behaves as intended:</w:t>
+      </w:r>
+    </w:p>
+    <w:p>
+      <w:pPr>
+        <w:pStyle w:val="MacroText"/>
+      </w:pPr>
+      <w:r>
+        <w:t># ROX</w:t>
+        <w:br/>
+        <w:t>ip -br address</w:t>
+        <w:br/>
+        <w:t>ip route</w:t>
+        <w:br/>
+        <w:t>ip route get 192.168.50.115</w:t>
+        <w:br/>
+        <w:t>ping -c 3 192.168.50.115</w:t>
+        <w:br/>
+        <w:t>nc -vz 192.168.50.115 1883</w:t>
+        <w:br/>
+        <w:br/>
+        <w:t># Pi</w:t>
+        <w:br/>
+        <w:t>ip -br address</w:t>
+        <w:br/>
+        <w:t>ip route</w:t>
+        <w:br/>
+        <w:t>ip route get 192.168.50.50</w:t>
+        <w:br/>
+        <w:t>ping -c 3 192.168.50.50</w:t>
+        <w:br/>
+        <w:t>ss -ltnp | grep 1883</w:t>
+      </w:r>
+    </w:p>
+    <w:p>
+      <w:pPr/>
+      <w:r>
+        <w:t>Because both devices are direct DTLabOpen peers, one-way-only reachability is not expected. Check subnet prefixes, duplicate addresses, host firewalls and interface-specific routes on both devices.</w:t>
+      </w:r>
+    </w:p>
+    <w:p>
+      <w:pPr>
+        <w:pStyle w:val="Heading2"/>
+      </w:pPr>
+      <w:r>
         <w:t>ROX cannot connect to MQTT</w:t>
       </w:r>
     </w:p>
@@ -9146,7 +9385,7 @@
                 <w:color w:val="1C2D38"/>
                 <w:sz w:val="16"/>
               </w:rPr>
-              <w:t>ping -c 3 192.168.1.115</w:t>
+              <w:t>ping -c 3 192.168.50.115</w:t>
             </w:r>
           </w:p>
           <w:p>
@@ -9160,7 +9399,7 @@
                 <w:color w:val="1C2D38"/>
                 <w:sz w:val="16"/>
               </w:rPr>
-              <w:t>nc -vz 192.168.1.115 1883</w:t>
+              <w:t>nc -vz 192.168.50.115 1883</w:t>
             </w:r>
           </w:p>
           <w:p>
@@ -9174,7 +9413,7 @@
                 <w:color w:val="1C2D38"/>
                 <w:sz w:val="16"/>
               </w:rPr>
-              <w:t>mosquitto_pub -h 192.168.1.115 \</w:t>
+              <w:t>mosquitto_pub -h 192.168.50.115 \</w:t>
             </w:r>
           </w:p>
           <w:p>
@@ -9666,140 +9905,198 @@
     </w:p>
     <w:p>
       <w:pPr>
+        <w:pStyle w:val="ListBullet"/>
         <w:spacing w:after="30"/>
         <w:ind w:left="312" w:hanging="312"/>
       </w:pPr>
       <w:r>
-        <w:t xml:space="preserve">☐  Pi username: </w:t>
-      </w:r>
-      <w:r>
-        <w:rPr>
-          <w:rFonts w:ascii="Liberation Mono" w:hAnsi="Liberation Mono"/>
-          <w:color w:val="2A404D"/>
-          <w:sz w:val="18"/>
-        </w:rPr>
-        <w:t>____________________</w:t>
-      </w:r>
-    </w:p>
-    <w:p>
-      <w:pPr>
+        <w:t>☐ Pi username: raspberrypi / actual: ____________________</w:t>
+      </w:r>
+    </w:p>
+    <w:p>
+      <w:pPr>
+        <w:pStyle w:val="ListBullet"/>
         <w:spacing w:after="30"/>
         <w:ind w:left="312" w:hanging="312"/>
       </w:pPr>
       <w:r>
-        <w:t xml:space="preserve">☐  Pi hostname: </w:t>
-      </w:r>
-      <w:r>
-        <w:rPr>
-          <w:rFonts w:ascii="Liberation Mono" w:hAnsi="Liberation Mono"/>
-          <w:color w:val="2A404D"/>
-          <w:sz w:val="18"/>
-        </w:rPr>
-        <w:t>____________________</w:t>
-      </w:r>
-    </w:p>
-    <w:p>
-      <w:pPr>
+        <w:t>☐ Pi hostname: raspberrypi / actual: ____________________</w:t>
+      </w:r>
+    </w:p>
+    <w:p>
+      <w:pPr>
+        <w:pStyle w:val="ListBullet"/>
         <w:spacing w:after="30"/>
         <w:ind w:left="312" w:hanging="312"/>
       </w:pPr>
       <w:r>
-        <w:t xml:space="preserve">☐  Pi/MQTT IPv4 address: </w:t>
-      </w:r>
-      <w:r>
-        <w:rPr>
-          <w:rFonts w:ascii="Liberation Mono" w:hAnsi="Liberation Mono"/>
-          <w:color w:val="2A404D"/>
-          <w:sz w:val="18"/>
-        </w:rPr>
-        <w:t>____________________</w:t>
-      </w:r>
-    </w:p>
-    <w:p>
-      <w:pPr>
+        <w:t>☐ Pi eth0 / DTLabOpen IPv4: 192.168.50.115 / prefix: ____________________</w:t>
+      </w:r>
+    </w:p>
+    <w:p>
+      <w:pPr>
+        <w:pStyle w:val="ListBullet"/>
         <w:spacing w:after="30"/>
         <w:ind w:left="312" w:hanging="312"/>
       </w:pPr>
       <w:r>
-        <w:t xml:space="preserve">☐  MQTT port: </w:t>
-      </w:r>
-      <w:r>
-        <w:rPr>
-          <w:rFonts w:ascii="Liberation Mono" w:hAnsi="Liberation Mono"/>
-          <w:color w:val="2A404D"/>
-          <w:sz w:val="18"/>
-        </w:rPr>
-        <w:t>____________________</w:t>
-      </w:r>
-    </w:p>
-    <w:p>
-      <w:pPr>
+        <w:t>☐ Pi wlan0 / Ilmatar IPv4: 192.168.0.116 / prefix: ____________________</w:t>
+      </w:r>
+    </w:p>
+    <w:p>
+      <w:pPr>
+        <w:pStyle w:val="ListBullet"/>
         <w:spacing w:after="30"/>
         <w:ind w:left="312" w:hanging="312"/>
       </w:pPr>
       <w:r>
-        <w:t xml:space="preserve">☐  Pi project path: </w:t>
-      </w:r>
-      <w:r>
-        <w:rPr>
-          <w:rFonts w:ascii="Liberation Mono" w:hAnsi="Liberation Mono"/>
-          <w:color w:val="2A404D"/>
-          <w:sz w:val="18"/>
-        </w:rPr>
-        <w:t>____________________</w:t>
-      </w:r>
-    </w:p>
-    <w:p>
-      <w:pPr>
+        <w:t>☐ DTLabOpen gateway: 192.168.1.1</w:t>
+      </w:r>
+    </w:p>
+    <w:p>
+      <w:pPr>
+        <w:pStyle w:val="ListBullet"/>
         <w:spacing w:after="30"/>
         <w:ind w:left="312" w:hanging="312"/>
       </w:pPr>
       <w:r>
-        <w:t xml:space="preserve">☐  Flask address/port: </w:t>
-      </w:r>
-      <w:r>
-        <w:rPr>
-          <w:rFonts w:ascii="Liberation Mono" w:hAnsi="Liberation Mono"/>
-          <w:color w:val="2A404D"/>
-          <w:sz w:val="18"/>
-        </w:rPr>
-        <w:t>____________________</w:t>
-      </w:r>
-    </w:p>
-    <w:p>
-      <w:pPr>
+        <w:t>☐ Pi default route uses Ilmatar; DTLabOpen is never-default.</w:t>
+      </w:r>
+    </w:p>
+    <w:p>
+      <w:pPr>
+        <w:pStyle w:val="ListBullet"/>
         <w:spacing w:after="30"/>
         <w:ind w:left="312" w:hanging="312"/>
       </w:pPr>
       <w:r>
-        <w:t>☐  ROX can ping the Pi.</w:t>
-      </w:r>
-    </w:p>
-    <w:p>
-      <w:pPr>
+        <w:t>☐ Pi project path: ~/VDA5050-Paper-Dev</w:t>
+      </w:r>
+    </w:p>
+    <w:p>
+      <w:pPr>
+        <w:pStyle w:val="ListBullet"/>
         <w:spacing w:after="30"/>
         <w:ind w:left="312" w:hanging="312"/>
       </w:pPr>
       <w:r>
-        <w:t>☐  ROX can open TCP connection to MQTT port.</w:t>
-      </w:r>
-    </w:p>
-    <w:p>
-      <w:pPr>
+        <w:t>☐ MQTT/Flask address: 192.168.50.115:1883 / :5000</w:t>
+      </w:r>
+    </w:p>
+    <w:p>
+      <w:pPr>
+        <w:pStyle w:val="ListBullet"/>
         <w:spacing w:after="30"/>
         <w:ind w:left="312" w:hanging="312"/>
       </w:pPr>
       <w:r>
-        <w:t>☐  MQTT is restricted to the trusted lab network.</w:t>
-      </w:r>
-    </w:p>
-    <w:p>
-      <w:pPr>
+        <w:t>☐ ROX DTLabOpen IPv4: 192.168.50.50 / prefix: ____________________</w:t>
+      </w:r>
+    </w:p>
+    <w:p>
+      <w:pPr>
+        <w:pStyle w:val="ListBullet"/>
         <w:spacing w:after="30"/>
         <w:ind w:left="312" w:hanging="312"/>
       </w:pPr>
       <w:r>
-        <w:t>☐  Authentication/TLS plan documented for non-lab use.</w:t>
+        <w:t>☐ DTLabOpen connection/interface on ROX: ____________________</w:t>
+      </w:r>
+    </w:p>
+    <w:p>
+      <w:pPr>
+        <w:pStyle w:val="ListBullet"/>
+      </w:pPr>
+      <w:r>
+        <w:t>☐ DTLabOpen gateway observed on ROX: ____________________</w:t>
+      </w:r>
+    </w:p>
+    <w:p>
+      <w:pPr>
+        <w:pStyle w:val="ListBullet"/>
+      </w:pPr>
+      <w:r>
+        <w:t>☐ DTLabOpen gateway observed on Pi Ethernet: ____________________</w:t>
+      </w:r>
+    </w:p>
+    <w:p>
+      <w:pPr>
+        <w:pStyle w:val="ListBullet"/>
+      </w:pPr>
+      <w:r>
+        <w:t>☐ Pi route to 192.168.50.50 uses eth0.</w:t>
+      </w:r>
+    </w:p>
+    <w:p>
+      <w:pPr>
+        <w:pStyle w:val="ListBullet"/>
+      </w:pPr>
+      <w:r>
+        <w:t>☐ ROX route to 192.168.50.115 uses the DTLabOpen-facing interface.</w:t>
+      </w:r>
+    </w:p>
+    <w:p>
+      <w:pPr>
+        <w:pStyle w:val="ListBullet"/>
+      </w:pPr>
+      <w:r>
+        <w:t>☐ Engineering PC addresses/reservations: ____________________</w:t>
+      </w:r>
+    </w:p>
+    <w:p>
+      <w:pPr>
+        <w:pStyle w:val="ListBullet"/>
+      </w:pPr>
+      <w:r>
+        <w:t>☐ Pi and ROX can ping each other bidirectionally.</w:t>
+      </w:r>
+    </w:p>
+    <w:p>
+      <w:pPr>
+        <w:pStyle w:val="ListBullet"/>
+      </w:pPr>
+      <w:r>
+        <w:t>☐ ROX can open TCP 1883 and TCP 5000 on 192.168.50.115.</w:t>
+      </w:r>
+    </w:p>
+    <w:p>
+      <w:pPr>
+        <w:pStyle w:val="ListBullet"/>
+      </w:pPr>
+      <w:r>
+        <w:t>☐ ROX can open TCP connection to MQTT port 1883.</w:t>
+      </w:r>
+    </w:p>
+    <w:p>
+      <w:pPr>
+        <w:pStyle w:val="ListBullet"/>
+      </w:pPr>
+      <w:r>
+        <w:t>☐ ROX commissioning MQTT message is observed on the Pi.</w:t>
+      </w:r>
+    </w:p>
+    <w:p>
+      <w:pPr>
+        <w:pStyle w:val="ListBullet"/>
+      </w:pPr>
+      <w:r>
+        <w:t>☐ Pi-to-ROX management path (if required): port-forward / static route / direct interface / not required.</w:t>
+      </w:r>
+    </w:p>
+    <w:p>
+      <w:pPr>
+        <w:pStyle w:val="ListBullet"/>
+      </w:pPr>
+      <w:r>
+        <w:t>☐ Anonymous MQTT is blocked on Ilmatar or explicitly approved.</w:t>
+      </w:r>
+    </w:p>
+    <w:p>
+      <w:pPr>
+        <w:pStyle w:val="ListBullet"/>
+      </w:pPr>
+      <w:r>
+        <w:t>☐ Authentication/TLS plan documented for non-lab use.</w:t>
       </w:r>
     </w:p>
     <w:p>
@@ -9816,15 +10113,7 @@
         <w:ind w:left="312" w:hanging="312"/>
       </w:pPr>
       <w:r>
-        <w:t xml:space="preserve">☐  ROS distribution: </w:t>
-      </w:r>
-      <w:r>
-        <w:rPr>
-          <w:rFonts w:ascii="Liberation Mono" w:hAnsi="Liberation Mono"/>
-          <w:color w:val="2A404D"/>
-          <w:sz w:val="18"/>
-        </w:rPr>
-        <w:t>____________________</w:t>
+        <w:t>☐  ROS distribution: jazzy / actual installed: ____________________</w:t>
       </w:r>
     </w:p>
     <w:p>
@@ -11573,6 +11862,70 @@
         <w:pStyle w:val="Heading2"/>
       </w:pPr>
       <w:r>
+        <w:t>Repository and credential hygiene</w:t>
+      </w:r>
+    </w:p>
+    <w:p>
+      <w:pPr>
+        <w:pStyle w:val="ListBullet"/>
+      </w:pPr>
+      <w:r>
+        <w:t>☐ Exact Git commit recorded for the Pi and ROX checkouts.</w:t>
+      </w:r>
+    </w:p>
+    <w:p>
+      <w:pPr>
+        <w:pStyle w:val="ListBullet"/>
+      </w:pPr>
+      <w:r>
+        <w:t>☐ crane_edge/access.txt is not returned by git ls-files.</w:t>
+      </w:r>
+    </w:p>
+    <w:p>
+      <w:pPr>
+        <w:pStyle w:val="ListBullet"/>
+      </w:pPr>
+      <w:r>
+        <w:t>☐ Credential ignore rules are active in .gitignore.</w:t>
+      </w:r>
+    </w:p>
+    <w:p>
+      <w:pPr>
+        <w:pStyle w:val="ListBullet"/>
+      </w:pPr>
+      <w:r>
+        <w:t>☐ Previously published crane credential has been rotated/revoked.</w:t>
+      </w:r>
+    </w:p>
+    <w:p>
+      <w:pPr>
+        <w:pStyle w:val="ListBullet"/>
+      </w:pPr>
+      <w:r>
+        <w:t>☐ Repository history has been purged or access risk has been formally accepted and documented.</w:t>
+      </w:r>
+    </w:p>
+    <w:p>
+      <w:pPr>
+        <w:pStyle w:val="ListBullet"/>
+      </w:pPr>
+      <w:r>
+        <w:t>☐ No secrets are present in git status, git diff, documentation or commissioning logs.</w:t>
+      </w:r>
+    </w:p>
+    <w:p>
+      <w:pPr>
+        <w:pStyle w:val="ListBullet"/>
+      </w:pPr>
+      <w:r>
+        <w:t>☐ Static checks pass after repository changes.</w:t>
+      </w:r>
+    </w:p>
+    <w:p>
+      <w:pPr>
+        <w:pStyle w:val="Heading2"/>
+      </w:pPr>
+      <w:r>
         <w:t>Sign-off</w:t>
       </w:r>
     </w:p>
@@ -11680,7 +12033,7 @@
         <w:color w:val="526772"/>
         <w:sz w:val="16"/>
       </w:rPr>
-      <w:t xml:space="preserve">Commissioning runbook | 20 July 2026    </w:t>
+      <w:t xml:space="preserve">Commissioning runbook | 21 July 2026    </w:t>
     </w:r>
     <w:r>
       <w:rPr>

</xml_diff>